<commit_message>
docs: record the 2026-06-19 session changes in the change-record + suggestions docs
Adds a §6 (2026-06-19 update) to both docs/*_to_code_change_record_and_suggestions.docx
and a matching Round 13 / §8 to the living *_CHANGE_RECORD.md files: static-serving
allowlist + source/docs exposure fix, de-identified-export name strip, stage-B opening
card-leak fix, constant-time tokens + scoped CORS, results-dashboard robustness, recruiter
attribution tooling, the /about landing page, and the gpt-5.1 validation of the stage-B
direct prompt.

Co-Authored-By: Claude Opus 4.8 <noreply@anthropic.com>
Claude-Session: https://claude.ai/code/session_01NdEGA42SBTaWTZABDKutAB
</commit_message>
<xml_diff>
--- a/docs/Brief_v4.5_to_code_change_record_and_suggestions.docx
+++ b/docs/Brief_v4.5_to_code_change_record_and_suggestions.docx
@@ -29,6 +29,9 @@
           <w:sz w:val="18"/>
         </w:rPr>
         <w:t>Generated 2026-06-18 from the current code on branch claude/peaceful-ramanujan-7iakx2. Each row: what the guidance currently says → what the code now does → the suggested edit. Apply these to bring the guidance document in line with the implementation.</w:t>
+      </w:r>
+      <w:r>
+        <w:t xml:space="preserve">  Updated 2026-06-19 (branch claude/sleepy-brown-039dhc) — see §6 below.</w:t>
       </w:r>
     </w:p>
     <w:p>
@@ -745,6 +748,59 @@
         <w:t>Repo: GitHub Actions CI (npm ci → test → build), .nvmrc, .editorconfig, LICENSE.md added; superseded docs moved to docs/archive/; build_sync_test guards build/ against source drift.</w:t>
       </w:r>
     </w:p>
+    <w:p>
+      <w:pPr>
+        <w:pStyle w:val="Heading1"/>
+      </w:pPr>
+      <w:r>
+        <w:t>6. 2026-06-19 update — security hardening, stage-B fix, recruiter tooling, gpt-5.1 validation</w:t>
+      </w:r>
+    </w:p>
+    <w:p>
+      <w:r>
+        <w:t>Changes since the 2026-06-18 generation (session on branch claude/sleepy-brown-039dhc; merged to main and deployed on Railway). All verified — npm test + the Python eval pytest green, and the security + stage-B fixes confirmed live in production.</w:t>
+      </w:r>
+    </w:p>
+    <w:p>
+      <w:pPr>
+        <w:pStyle w:val="ListBullet"/>
+      </w:pPr>
+      <w:r>
+        <w:t>Stage-B direct-arm stimulus integrity: the direct arm now shows its five recommendation cards (not a raw JSON block) in its opening turn — verified on the production model (gpt-5.1) to also run the geographic-realism location step after the participant settles on one career. Previously the direct arm's first message could leak the raw card JSON to participants.</w:t>
+      </w:r>
+    </w:p>
+    <w:p>
+      <w:pPr>
+        <w:pStyle w:val="ListBullet"/>
+      </w:pPr>
+      <w:r>
+        <w:t>De-identified export truly de-identifies: participant names are now stripped from the “de-identified” analysis export (it had been labelled de-identified while still carrying the self-entered name). Ethics / data-sharing.</w:t>
+      </w:r>
+    </w:p>
+    <w:p>
+      <w:pPr>
+        <w:pStyle w:val="ListBullet"/>
+      </w:pPr>
+      <w:r>
+        <w:t>Study-design documents are no longer publicly downloadable: the production server had been serving docs/*.docx (this Brief, the Build Plan, the change-records) to anyone with the URL; that is now blocked. Research-IP / pre-registration hygiene.</w:t>
+      </w:r>
+    </w:p>
+    <w:p>
+      <w:pPr>
+        <w:pStyle w:val="ListBullet"/>
+      </w:pPr>
+      <w:r>
+        <w:t>Researcher fielding — recruiter attribution: each recruit link can now be tagged with who is distributing it (Andrea / Thy / Kaehl / Gleb), shown in the Recruit groups (“sent by X · Y version”) and the Sessions list, filterable, and included in exports — for per-recruiter recruitment tracking. No participant-facing change.</w:t>
+      </w:r>
+    </w:p>
+    <w:p>
+      <w:pPr>
+        <w:pStyle w:val="ListBullet"/>
+      </w:pPr>
+      <w:r>
+        <w:t>Stage-B direct prompt confirmed to meet design on gpt-5.1: exactly 5 cards, the direct (no-exploration) manipulation, ten-year framing, and the location step all behave as specified.</w:t>
+      </w:r>
+    </w:p>
     <w:sectPr>
       <w:pgSz w:w="12240" w:h="15840"/>
       <w:pgMar w:top="1440" w:right="1800" w:bottom="1440" w:left="1800" w:header="720" w:footer="720" w:gutter="0"/>

</xml_diff>

<commit_message>
Revert the stage-C baseline trim — restore the original baseline prompt
Per Kangzhi: the §8.3-minimal baseline trim isn't wanted. Restores buildBaselinePrompt
to its prior form (the decade/AI future-grounding paragraph, money, advice and
multi-part lines are back), and reverts the accompanying change-record / suggestions /
prompt-reference doc edits to their pre-trim state.

Co-Authored-By: Claude Opus 4.8 <noreply@anthropic.com>
Claude-Session: https://claude.ai/code/session_01NdEGA42SBTaWTZABDKutAB
</commit_message>
<xml_diff>
--- a/docs/Brief_v4.5_to_code_change_record_and_suggestions.docx
+++ b/docs/Brief_v4.5_to_code_change_record_and_suggestions.docx
@@ -801,14 +801,6 @@
         <w:t>Stage-B direct prompt confirmed to meet design on gpt-5.1: exactly 5 cards, the direct (no-exploration) manipulation, ten-year framing, and the location step all behave as specified.</w:t>
       </w:r>
     </w:p>
-    <w:p>
-      <w:pPr>
-        <w:pStyle w:val="ListBullet"/>
-      </w:pPr>
-      <w:r>
-        <w:t>Stage-C baseline trimmed to the minimal control: §3.3/§8.3 define the baseline as the minimally engineered role-play with no design-component instructions; the implementation had grown an elaborate decade/AI grounding paragraph plus money/advice/multi-part lines. Removed (~46% shorter), keeping only the shared floors that keep the arms comparable (reply-length, geography, no-invented-memories). The closeness/vividness/continuity components stay absent from the baseline — still the manipulation. Validated on gpt-5.1: length-comparable to MAIN, coherent, honest about a thin market, no fabricated shared memories — the main-vs-baseline contrast is unchanged.</w:t>
-      </w:r>
-    </w:p>
     <w:sectPr>
       <w:pgSz w:w="12240" w:h="15840"/>
       <w:pgMar w:top="1440" w:right="1800" w:bottom="1440" w:left="1800" w:header="720" w:footer="720" w:gutter="0"/>

</xml_diff>